<commit_message>
CV: Australian experience first, split Austino and Baretto, simplify skills
Co-Authored-By: Claude Opus 5.5 <noreply@anthropic.com>
Claude-Session: https://claude.ai/code/session_01J1q3gesRYo6fUP4q5cKdvd
</commit_message>
<xml_diff>
--- a/curriculo-victor-braga/Victor_Braga_CV.docx
+++ b/curriculo-victor-braga/Victor_Braga_CV.docx
@@ -78,6 +78,19 @@
     </w:p>
     <w:p>
       <w:pPr>
+        <w:spacing w:after="60" w:before="0"/>
+      </w:pPr>
+      <w:r>
+        <w:rPr>
+          <w:b w:val="0"/>
+          <w:i w:val="0"/>
+          <w:sz w:val="20"/>
+        </w:rPr>
+        <w:t>Graphic designer with 7 years of agency experience in Brazil, producing print and point-of-sale material, large-format signage and digital artwork for brands such as Cinemark, Wickbold and Seven Boys. Looking for a role in screen printing, print production, signage or a creative studio.</w:t>
+      </w:r>
+    </w:p>
+    <w:p>
+      <w:pPr>
         <w:spacing w:after="40" w:before="0"/>
       </w:pPr>
       <w:r>
@@ -86,7 +99,125 @@
           <w:i w:val="0"/>
           <w:sz w:val="20"/>
         </w:rPr>
-        <w:t>Graphic designer with 7 years of agency experience in Brazil, producing print and point-of-sale material, large-format signage and digital artwork for brands such as Cinemark, Wickbold and Seven Boys. Now based in Brisbane, with 2026 experience in Australian hospitality where I opened and closed venues, handled stock and worked every station. Comfortable at the computer and on the floor: I can prepare artwork, check it before it goes to print and help on the production side. Looking for a role in screen printing, print production, signage or a creative studio.</w:t>
+        <w:t>Now based in Brisbane, with 2026 experience in Australian hospitality across front of house, kitchen and pizza chef roles. Trusted to open and close venues, manage stock and work every station during busy services.</w:t>
+      </w:r>
+    </w:p>
+    <w:p>
+      <w:pPr>
+        <w:spacing w:after="60" w:before="160"/>
+        <w:pBdr>
+          <w:bottom w:val="single" w:sz="6" w:space="1" w:color="1F4E79"/>
+        </w:pBdr>
+      </w:pPr>
+      <w:r>
+        <w:rPr>
+          <w:b/>
+          <w:i w:val="0"/>
+          <w:color w:val="1F4E79"/>
+          <w:sz w:val="22"/>
+        </w:rPr>
+        <w:t>AUSTRALIAN WORK EXPERIENCE</w:t>
+      </w:r>
+    </w:p>
+    <w:p>
+      <w:pPr>
+        <w:spacing w:after="0" w:before="80"/>
+      </w:pPr>
+      <w:r>
+        <w:rPr>
+          <w:b/>
+          <w:sz w:val="21"/>
+        </w:rPr>
+        <w:t>Front of House</w:t>
+      </w:r>
+      <w:r>
+        <w:rPr>
+          <w:sz w:val="20"/>
+        </w:rPr>
+        <w:t xml:space="preserve"> | Austino Cuisine – Maroochydore Club, Sunshine Coast | 2026</w:t>
+      </w:r>
+    </w:p>
+    <w:p>
+      <w:pPr>
+        <w:pStyle w:val="ListBullet"/>
+        <w:spacing w:after="20"/>
+        <w:ind w:left="283"/>
+      </w:pPr>
+      <w:r>
+        <w:rPr>
+          <w:sz w:val="20"/>
+        </w:rPr>
+        <w:t>Served food and drinks, took orders accurately and kept the floor clean and presentable.</w:t>
+      </w:r>
+    </w:p>
+    <w:p>
+      <w:pPr>
+        <w:pStyle w:val="ListBullet"/>
+        <w:spacing w:after="20"/>
+        <w:ind w:left="283"/>
+      </w:pPr>
+      <w:r>
+        <w:rPr>
+          <w:sz w:val="20"/>
+        </w:rPr>
+        <w:t>Organised food distribution from the pass and supported the kitchen and dishwashing station when needed.</w:t>
+      </w:r>
+    </w:p>
+    <w:p>
+      <w:pPr>
+        <w:spacing w:after="0" w:before="80"/>
+      </w:pPr>
+      <w:r>
+        <w:rPr>
+          <w:b/>
+          <w:sz w:val="21"/>
+        </w:rPr>
+        <w:t>Front of House / Kitchen Hand / Pizza Chef</w:t>
+      </w:r>
+      <w:r>
+        <w:rPr>
+          <w:sz w:val="20"/>
+        </w:rPr>
+        <w:t xml:space="preserve"> | Baretto Pizza, Brisbane | 2026</w:t>
+      </w:r>
+    </w:p>
+    <w:p>
+      <w:pPr>
+        <w:pStyle w:val="ListBullet"/>
+        <w:spacing w:after="20"/>
+        <w:ind w:left="283"/>
+      </w:pPr>
+      <w:r>
+        <w:rPr>
+          <w:sz w:val="20"/>
+        </w:rPr>
+        <w:t>Opened and closed the restaurant and kitchen, including all cleaning procedures.</w:t>
+      </w:r>
+    </w:p>
+    <w:p>
+      <w:pPr>
+        <w:pStyle w:val="ListBullet"/>
+        <w:spacing w:after="20"/>
+        <w:ind w:left="283"/>
+      </w:pPr>
+      <w:r>
+        <w:rPr>
+          <w:sz w:val="20"/>
+        </w:rPr>
+        <w:t>Managed stock, ordering and storage, plus Uber Eats and takeaway orders.</w:t>
+      </w:r>
+    </w:p>
+    <w:p>
+      <w:pPr>
+        <w:pStyle w:val="ListBullet"/>
+        <w:spacing w:after="20"/>
+        <w:ind w:left="283"/>
+      </w:pPr>
+      <w:r>
+        <w:rPr>
+          <w:sz w:val="20"/>
+        </w:rPr>
+        <w:t>Prepared ingredients and cooked pizzas during busy services, following food safety standards.</w:t>
       </w:r>
     </w:p>
     <w:p>
@@ -265,67 +396,6 @@
           <w:color w:val="1F4E79"/>
           <w:sz w:val="22"/>
         </w:rPr>
-        <w:t>AUSTRALIAN WORK EXPERIENCE</w:t>
-      </w:r>
-    </w:p>
-    <w:p>
-      <w:pPr>
-        <w:spacing w:after="0" w:before="80"/>
-      </w:pPr>
-      <w:r>
-        <w:rPr>
-          <w:b/>
-          <w:sz w:val="21"/>
-        </w:rPr>
-        <w:t>Front of House / Kitchen Hand / Pizza Chef</w:t>
-      </w:r>
-      <w:r>
-        <w:rPr>
-          <w:sz w:val="20"/>
-        </w:rPr>
-        <w:t xml:space="preserve"> | Baretto Pizza, Brisbane and Austino Cuisine – Maroochydore Club, Sunshine Coast | 2026</w:t>
-      </w:r>
-    </w:p>
-    <w:p>
-      <w:pPr>
-        <w:pStyle w:val="ListBullet"/>
-        <w:spacing w:after="20"/>
-        <w:ind w:left="283"/>
-      </w:pPr>
-      <w:r>
-        <w:rPr>
-          <w:sz w:val="20"/>
-        </w:rPr>
-        <w:t>Trusted to open and close the venue, manage stock and place orders.</w:t>
-      </w:r>
-    </w:p>
-    <w:p>
-      <w:pPr>
-        <w:pStyle w:val="ListBullet"/>
-        <w:spacing w:after="20"/>
-        <w:ind w:left="283"/>
-      </w:pPr>
-      <w:r>
-        <w:rPr>
-          <w:sz w:val="20"/>
-        </w:rPr>
-        <w:t>Worked across front of house, kitchen and pizza oven during busy services, following food safety and hygiene standards.</w:t>
-      </w:r>
-    </w:p>
-    <w:p>
-      <w:pPr>
-        <w:spacing w:after="60" w:before="160"/>
-        <w:pBdr>
-          <w:bottom w:val="single" w:sz="6" w:space="1" w:color="1F4E79"/>
-        </w:pBdr>
-      </w:pPr>
-      <w:r>
-        <w:rPr>
-          <w:b/>
-          <w:i w:val="0"/>
-          <w:color w:val="1F4E79"/>
-          <w:sz w:val="22"/>
-        </w:rPr>
         <w:t>SKILLS</w:t>
       </w:r>
     </w:p>
@@ -335,39 +405,10 @@
       </w:pPr>
       <w:r>
         <w:rPr>
-          <w:b/>
+          <w:b w:val="0"/>
+          <w:i w:val="0"/>
+          <w:sz w:val="20"/>
         </w:rPr>
-        <w:t xml:space="preserve">Software: </w:t>
-      </w:r>
-      <w:r>
-        <w:t>Adobe Photoshop, Illustrator, Lightroom, After Effects, Figma</w:t>
-      </w:r>
-    </w:p>
-    <w:p>
-      <w:pPr>
-        <w:spacing w:after="20" w:before="0"/>
-      </w:pPr>
-      <w:r>
-        <w:rPr>
-          <w:b/>
-        </w:rPr>
-        <w:t xml:space="preserve">Design: </w:t>
-      </w:r>
-      <w:r>
-        <w:t>Print design, vector artwork, logo and brand identity, signage and large format, posters and flyers, illustration, photo retouching, photography</w:t>
-      </w:r>
-    </w:p>
-    <w:p>
-      <w:pPr>
-        <w:spacing w:after="20" w:before="0"/>
-      </w:pPr>
-      <w:r>
-        <w:rPr>
-          <w:b/>
-        </w:rPr>
-        <w:t xml:space="preserve">Workplace: </w:t>
-      </w:r>
-      <w:r>
         <w:t>Meeting deadlines, attention to detail, teamwork, customer service, stock control, hands-on and physical work</w:t>
       </w:r>
     </w:p>

</xml_diff>

<commit_message>
CV: add Activ8 brand ambassador role and update headline
Co-Authored-By: Claude Opus 5.5 <noreply@anthropic.com>
Claude-Session: https://claude.ai/code/session_01J1q3gesRYo6fUP4q5cKdvd
</commit_message>
<xml_diff>
--- a/curriculo-victor-braga/Victor_Braga_CV.docx
+++ b/curriculo-victor-braga/Victor_Braga_CV.docx
@@ -28,7 +28,7 @@
           <w:color w:val="1F4E79"/>
           <w:sz w:val="24"/>
         </w:rPr>
-        <w:t>Graphic Designer | Print &amp; Production</w:t>
+        <w:t>Graphic Designer | Front of House | Kitchen Hand | Brand Ambassador</w:t>
       </w:r>
     </w:p>
     <w:p>
@@ -99,7 +99,7 @@
           <w:i w:val="0"/>
           <w:sz w:val="20"/>
         </w:rPr>
-        <w:t>Now based in Brisbane, with 2026 experience in Australian hospitality across front of house, kitchen and pizza chef roles. Trusted to open and close venues, manage stock and work every station during busy services.</w:t>
+        <w:t>Now based in Brisbane, with 2026 experience in Australian hospitality and promotions. Worked front of house, kitchen and pizza chef roles, and as a brand ambassador for Activ8 at Woolworths activations and Riverfire. Trusted to open and close venues, manage stock and lead on-site activations.</w:t>
       </w:r>
     </w:p>
     <w:p>
@@ -222,6 +222,63 @@
     </w:p>
     <w:p>
       <w:pPr>
+        <w:spacing w:after="0" w:before="80"/>
+      </w:pPr>
+      <w:r>
+        <w:rPr>
+          <w:b/>
+          <w:sz w:val="21"/>
+        </w:rPr>
+        <w:t>Brand Ambassador &amp; Promotional Staff</w:t>
+      </w:r>
+      <w:r>
+        <w:rPr>
+          <w:sz w:val="20"/>
+        </w:rPr>
+        <w:t xml:space="preserve"> | Activ8, Brisbane | 2026</w:t>
+      </w:r>
+    </w:p>
+    <w:p>
+      <w:pPr>
+        <w:pStyle w:val="ListBullet"/>
+        <w:spacing w:after="20"/>
+        <w:ind w:left="283"/>
+      </w:pPr>
+      <w:r>
+        <w:rPr>
+          <w:sz w:val="20"/>
+        </w:rPr>
+        <w:t>Woolworths – Product Sampling &amp; On-site Activation Lead: engaged customers, introduced products and handed out samples. Led on site, managing stock and deliveries, making operational decisions and reporting to campaign coordinators.</w:t>
+      </w:r>
+    </w:p>
+    <w:p>
+      <w:pPr>
+        <w:pStyle w:val="ListBullet"/>
+        <w:spacing w:after="20"/>
+        <w:ind w:left="283"/>
+      </w:pPr>
+      <w:r>
+        <w:rPr>
+          <w:sz w:val="20"/>
+        </w:rPr>
+        <w:t>Australian Retirement Trust – Mascot Minder, Riverfire 2026 (Brisbane Festival): accompanied the mascot Artie, supported interactions with the public and guided it safely through large crowds.</w:t>
+      </w:r>
+    </w:p>
+    <w:p>
+      <w:pPr>
+        <w:pStyle w:val="ListBullet"/>
+        <w:spacing w:after="20"/>
+        <w:ind w:left="283"/>
+      </w:pPr>
+      <w:r>
+        <w:rPr>
+          <w:sz w:val="20"/>
+        </w:rPr>
+        <w:t>Street &amp; Event Promotion: handed out flyers in busy pedestrian areas and explained event details to the public.</w:t>
+      </w:r>
+    </w:p>
+    <w:p>
+      <w:pPr>
         <w:spacing w:after="60" w:before="160"/>
         <w:pBdr>
           <w:bottom w:val="single" w:sz="6" w:space="1" w:color="1F4E79"/>
@@ -336,19 +393,6 @@
           <w:sz w:val="20"/>
         </w:rPr>
         <w:t>Designed and prepared print files for flyers, posters, menus, labels and signage for supermarkets, craft breweries (Brewpoint, Odin, Da Corte) and restaurants.</w:t>
-      </w:r>
-    </w:p>
-    <w:p>
-      <w:pPr>
-        <w:pStyle w:val="ListBullet"/>
-        <w:spacing w:after="20"/>
-        <w:ind w:left="283"/>
-      </w:pPr>
-      <w:r>
-        <w:rPr>
-          <w:sz w:val="20"/>
-        </w:rPr>
-        <w:t>Worked across retail, hospitality, healthcare and service clients.</w:t>
       </w:r>
     </w:p>
     <w:p>
@@ -487,7 +531,7 @@
     </w:p>
     <w:sectPr>
       <w:pgSz w:w="11906" w:h="16838"/>
-      <w:pgMar w:top="850" w:right="1020" w:bottom="850" w:left="1020" w:header="720" w:footer="720" w:gutter="0"/>
+      <w:pgMar w:top="737" w:right="1020" w:bottom="737" w:left="1020" w:header="720" w:footer="720" w:gutter="0"/>
       <w:cols w:space="720"/>
       <w:docGrid w:linePitch="360"/>
     </w:sectPr>

</xml_diff>

<commit_message>
CV: add Behance link, refine typographic grid, redesign modernist layout
Co-Authored-By: Claude Opus 5.5 <noreply@anthropic.com>
Claude-Session: https://claude.ai/code/session_01J1q3gesRYo6fUP4q5cKdvd
</commit_message>
<xml_diff>
--- a/curriculo-victor-braga/Victor_Braga_CV.docx
+++ b/curriculo-victor-braga/Victor_Braga_CV.docx
@@ -42,7 +42,7 @@
           <w:i w:val="0"/>
           <w:sz w:val="20"/>
         </w:rPr>
-        <w:t>Fortitude Valley, Brisbane QLD | 0451 084 505 | victorbcsa@gmail.com</w:t>
+        <w:t>Brisbane QLD | 0451 084 505 | victorbcsa@gmail.com</w:t>
       </w:r>
     </w:p>
     <w:p>
@@ -56,7 +56,7 @@
           <w:i w:val="0"/>
           <w:sz w:val="20"/>
         </w:rPr>
-        <w:t>Portfolio: [ADD PORTFOLIO LINK]</w:t>
+        <w:t>Portfolio: behance.net/victorbragacsa</w:t>
       </w:r>
     </w:p>
     <w:p>

</xml_diff>